<commit_message>
feat: Add heritage management, update documentation, and introduce new Qwen agent skills and configurations.
</commit_message>
<xml_diff>
--- a/docs/DFD_Level_1_Recreation.docx
+++ b/docs/DFD_Level_1_Recreation.docx
@@ -66,7 +66,7 @@
       </w:r>
       <w:r>
         <w:pict>
-          <v:oval style="position:absolute;left:75pt;top:40pt;width:45pt;height:20pt;z-index:1;visibility:visible" fillcolor="#FFF2CC" strokecolor="#000000" strokeweight="1pt">
+          <v:roundrect style="position:absolute;left:75pt;top:40pt;width:45pt;height:20pt;z-index:1;visibility:visible" fillcolor="#FFF2CC" strokecolor="#000000" strokeweight="1pt">
             <v:textbox inset="2pt,2pt,2pt,2pt">
               <w:p>
                 <w:pPr>
@@ -81,7 +81,7 @@
                 </w:r>
               </w:p>
             </v:textbox>
-          </v:oval>
+          </v:roundrect>
         </w:pict>
       </w:r>
       <w:r>
@@ -159,7 +159,7 @@
       </w:r>
       <w:r>
         <w:pict>
-          <v:oval style="position:absolute;left:380pt;top:50pt;width:80pt;height:60pt;z-index:1;visibility:visible" fillcolor="#FFF2CC" strokecolor="#000000" strokeweight="1pt">
+          <v:roundrect style="position:absolute;left:380pt;top:50pt;width:80pt;height:60pt;z-index:1;visibility:visible" fillcolor="#FFF2CC" strokecolor="#000000" strokeweight="1pt">
             <v:textbox inset="2pt,2pt,2pt,2pt">
               <w:p>
                 <w:pPr>
@@ -174,7 +174,7 @@
                 </w:r>
               </w:p>
             </v:textbox>
-          </v:oval>
+          </v:roundrect>
         </w:pict>
       </w:r>
       <w:r>
@@ -370,7 +370,7 @@
       </w:r>
       <w:r>
         <w:pict>
-          <v:oval style="position:absolute;left:100pt;top:380pt;width:100pt;height:80pt;z-index:1;visibility:visible" fillcolor="#FFF2CC" strokecolor="#000000" strokeweight="1pt">
+          <v:roundrect style="position:absolute;left:100pt;top:380pt;width:100pt;height:80pt;z-index:1;visibility:visible" fillcolor="#FFF2CC" strokecolor="#000000" strokeweight="1pt">
             <v:textbox inset="2pt,2pt,2pt,2pt">
               <w:p>
                 <w:pPr>
@@ -389,7 +389,7 @@
                 </w:r>
               </w:p>
             </v:textbox>
-          </v:oval>
+          </v:roundrect>
         </w:pict>
       </w:r>
       <w:r>
@@ -643,7 +643,7 @@
       </w:r>
       <w:r>
         <w:pict>
-          <v:oval style="position:absolute;left:300pt;top:380pt;width:120pt;height:80pt;z-index:1;visibility:visible" fillcolor="#FFF2CC" strokecolor="#000000" strokeweight="1pt">
+          <v:roundrect style="position:absolute;left:300pt;top:380pt;width:120pt;height:80pt;z-index:1;visibility:visible" fillcolor="#FFF2CC" strokecolor="#000000" strokeweight="1pt">
             <v:textbox inset="2pt,2pt,2pt,2pt">
               <w:p>
                 <w:pPr>
@@ -662,7 +662,7 @@
                 </w:r>
               </w:p>
             </v:textbox>
-          </v:oval>
+          </v:roundrect>
         </w:pict>
       </w:r>
       <w:r>
@@ -929,7 +929,7 @@
       </w:r>
       <w:r>
         <w:pict>
-          <v:oval style="position:absolute;left:700pt;top:380pt;width:120pt;height:80pt;z-index:1;visibility:visible" fillcolor="#FFF2CC" strokecolor="#000000" strokeweight="1pt">
+          <v:roundrect style="position:absolute;left:700pt;top:380pt;width:120pt;height:80pt;z-index:1;visibility:visible" fillcolor="#FFF2CC" strokecolor="#000000" strokeweight="1pt">
             <v:textbox inset="2pt,2pt,2pt,2pt">
               <w:p>
                 <w:pPr>
@@ -948,7 +948,7 @@
                 </w:r>
               </w:p>
             </v:textbox>
-          </v:oval>
+          </v:roundrect>
         </w:pict>
       </w:r>
       <w:r>

</xml_diff>